<commit_message>
Update DuongMinhDuy_final.docx and add reference documents
</commit_message>
<xml_diff>
--- a/DuongMinhDuy_final.docx
+++ b/DuongMinhDuy_final.docx
@@ -30244,7 +30244,7 @@
           <w:sz w:val="23"/>
           <w:szCs w:val="23"/>
         </w:rPr>
-        <w:t>] K. J. Piczak, “ESC-50: Dataset for Environmental Sound Classification,” kho dữ liệu chính thức; README và meta/esc50.csv. https://github.com/karolpiczak/ESC-50. Truy cập ngày 22/09/2026.</w:t>
+        <w:t>] D. S. Park và cộng sự, “SpecAugment: A Simple Data Augmentation Method for Automatic Speech Recognition,” Interspeech 2019, tr. 2613–2617. DOI: 10.21437/Interspeech.2019-2680.</w:t>
       </w:r>
     </w:p>
     <w:p>
@@ -30271,119 +30271,7 @@
           <w:sz w:val="23"/>
           <w:szCs w:val="23"/>
         </w:rPr>
-        <w:t>] D. S. Park và cộng sự, “SpecAugment: A Simple Data Augmentation Method for Automatic Speech Recognition,” Interspeech 2019, tr. 2613–2617. DOI: 10.21437/Interspeech.2019-2680.</w:t>
-      </w:r>
-    </w:p>
-    <w:p>
-      <w:pPr>
-        <w:spacing w:after="100" w:line="276" w:lineRule="auto"/>
-        <w:ind w:left="567" w:hanging="567"/>
-      </w:pPr>
-      <w:r>
-        <w:rPr>
-          <w:sz w:val="23"/>
-          <w:szCs w:val="23"/>
-        </w:rPr>
-        <w:t>[</w:t>
-      </w:r>
-      <w:r>
-        <w:rPr>
-          <w:sz w:val="23"/>
-          <w:szCs w:val="23"/>
-        </w:rPr>
-        <w:t>3</w:t>
-      </w:r>
-      <w:r>
-        <w:rPr>
-          <w:sz w:val="23"/>
-          <w:szCs w:val="23"/>
-        </w:rPr>
         <w:t>] C. Banbury và cộng sự, “MicroNets: Neural Network Architectures for Deploying TinyML Applications on Commodity Microcontrollers,” arXiv:2010.11267, 2020.</w:t>
-      </w:r>
-    </w:p>
-    <w:p>
-      <w:pPr>
-        <w:spacing w:after="100" w:line="276" w:lineRule="auto"/>
-        <w:ind w:left="567" w:hanging="567"/>
-      </w:pPr>
-      <w:r>
-        <w:rPr>
-          <w:sz w:val="23"/>
-          <w:szCs w:val="23"/>
-        </w:rPr>
-        <w:t>[</w:t>
-      </w:r>
-      <w:r>
-        <w:rPr>
-          <w:sz w:val="23"/>
-          <w:szCs w:val="23"/>
-        </w:rPr>
-        <w:t>4</w:t>
-      </w:r>
-      <w:r>
-        <w:rPr>
-          <w:sz w:val="23"/>
-          <w:szCs w:val="23"/>
-        </w:rPr>
-        <w:t>] Librosa, tài liệu phiên bản 0.11.0: librosa.stft, librosa.feature.melspectrogram và librosa.resample. https://librosa.org/doc/0.11.0/. Truy cập ngày 22/09/2026.</w:t>
-      </w:r>
-    </w:p>
-    <w:p>
-      <w:pPr>
-        <w:spacing w:after="100" w:line="276" w:lineRule="auto"/>
-        <w:ind w:left="567" w:hanging="567"/>
-      </w:pPr>
-      <w:r>
-        <w:rPr>
-          <w:sz w:val="23"/>
-          <w:szCs w:val="23"/>
-        </w:rPr>
-        <w:t>[</w:t>
-      </w:r>
-      <w:r>
-        <w:rPr>
-          <w:sz w:val="23"/>
-          <w:szCs w:val="23"/>
-        </w:rPr>
-        <w:t>5</w:t>
-      </w:r>
-      <w:r>
-        <w:rPr>
-          <w:sz w:val="23"/>
-          <w:szCs w:val="23"/>
-        </w:rPr>
-        <w:t>] Scikit-learn, “Common pitfalls and recommended practices,” tài liệu chính thức, mục rò rỉ dữ liệu và chuẩn hóa. https://scikit-learn.org/stable/common_pitfalls.html. Truy cập ngày 22/09/2026.</w:t>
-      </w:r>
-    </w:p>
-    <w:p>
-      <w:pPr>
-        <w:spacing w:after="100" w:line="276" w:lineRule="auto"/>
-        <w:ind w:left="567" w:hanging="567"/>
-        <w:rPr>
-          <w:sz w:val="23"/>
-          <w:szCs w:val="23"/>
-        </w:rPr>
-      </w:pPr>
-      <w:r>
-        <w:rPr>
-          <w:sz w:val="23"/>
-          <w:szCs w:val="23"/>
-        </w:rPr>
-        <w:t>[</w:t>
-      </w:r>
-      <w:r>
-        <w:rPr>
-          <w:sz w:val="23"/>
-          <w:szCs w:val="23"/>
-        </w:rPr>
-        <w:t>5</w:t>
-      </w:r>
-      <w:r>
-        <w:rPr>
-          <w:sz w:val="23"/>
-          <w:szCs w:val="23"/>
-        </w:rPr>
-        <w:t>] Scikit-learn, “f1_score,” tài liệu chính thức, định nghĩa F1 và phép lấy trung bình macro. https://scikit-learn.org/stable/modules/generated/sklearn.metrics.f1_score.html. Truy cập ngày 22/09/2026.</w:t>
       </w:r>
     </w:p>
     <w:p>

</xml_diff>